<commit_message>
Align Wisdom and Discoveries catalog filters, fix RU/KY tools markup, and flank the pearl logo with mirrored ones.
Select All unchecked now yields a flat A-Z list for Category and Period; list-only filters hide on cards; brand mark keeps the original 1 on the left and a mirrored 1 on the right.

Co-authored-by: Cursor <cursoragent@cursor.com>
</commit_message>
<xml_diff>
--- a/ru/wisdom-stories/gods-pleasure.docx
+++ b/ru/wisdom-stories/gods-pleasure.docx
@@ -14,21 +14,19 @@
         <w:rPr>
           <w:sz w:val="52"/>
         </w:rPr>
-        <w:t>Благоволение</w:t>
+        <w:t>Благоволение Аллаха</w:t>
       </w:r>
       <w:proofErr w:type="spellEnd"/>
       <w:r>
         <w:rPr>
           <w:sz w:val="52"/>
         </w:rPr>
-        <w:t xml:space="preserve"> </w:t>
       </w:r>
       <w:proofErr w:type="spellStart"/>
       <w:r>
         <w:rPr>
           <w:sz w:val="52"/>
         </w:rPr>
-        <w:t>Аллаха</w:t>
       </w:r>
       <w:proofErr w:type="spellEnd"/>
     </w:p>
@@ -68,13 +66,12 @@
         <w:rPr>
           <w:lang/>
         </w:rPr>
-        <w:t>Я также пытался понять, что сильнее всего отдаляет человека от Аллаха, и осознал: нет ничего опаснее, чем ранить чужое сердце</w:t>
+        <w:t>Я также пытался понять, что сильнее всего отдаляет человека от Аллаха, и осознал: нет ничего опаснее, чем ранить чужое сердце».</w:t>
       </w:r>
       <w:r>
         <w:rPr>
           <w:lang w:val="ru-RU"/>
         </w:rPr>
-        <w:t>».</w:t>
       </w:r>
     </w:p>
     <w:p>
@@ -103,14 +100,13 @@
           <w:color w:val="9A7417"/>
           <w:lang w:val="ru-RU"/>
         </w:rPr>
-        <w:t>Мораль</w:t>
+        <w:t>Мораль: Самый короткий путь к благоволению Аллаха — дарить людям радость, а самое опасное из того, что отдаляет от Него, — ранить чужое сердце.</w:t>
       </w:r>
       <w:r>
         <w:rPr>
           <w:i w:val="0"/>
           <w:lang w:val="ru-RU"/>
         </w:rPr>
-        <w:t xml:space="preserve"> </w:t>
       </w:r>
       <w:r>
         <w:rPr>
@@ -120,7 +116,6 @@
           <w:color w:val="auto"/>
           <w:lang w:val="ru-RU"/>
         </w:rPr>
-        <w:t>Самый короткий путь к благоволению Аллаха — дарить людям радость, а самое опасное из того, что отдаляет от Него, — ранить чужое сердце</w:t>
       </w:r>
       <w:r>
         <w:rPr>
@@ -129,7 +124,6 @@
           <w:color w:val="3F3826"/>
           <w:lang w:val="ru-RU"/>
         </w:rPr>
-        <w:t>.</w:t>
       </w:r>
     </w:p>
     <w:p>

</xml_diff>